<commit_message>
feat: Add Booking Occupants Management
- Introduced BookingOccupant model to manage occupants associated with bookings.
- Updated AppDbContext to include BookingOccupants DbSet and configured entity relationships.
- Enhanced IBookingService interface with methods for managing occupants: GetOccupantsAsync, AddOccupantAsync, UpdateOccupantAsync, and RemoveOccupantAsync.
- Implemented DTOs for occupant management: ResidenceReportOccupantDto, AddBookingOccupantDto, and UpdateBookingOccupantDto.
- Modified Booking model to include a collection of BookingOccupants.
- Updated BookingController to handle occupant-related API endpoints.
- Added SQL scripts to create the booking_occupants table and migrate tenant identity fields to the users table.
- Adjusted tests to cover new occupant management features and ensure proper functionality.
</commit_message>
<xml_diff>
--- a/DocumentForm/A17.docx
+++ b/DocumentForm/A17.docx
@@ -1139,7 +1139,7 @@
                     </wp:anchor>
                   </w:drawing>
                 </mc:Choice>
-                <mc:Fallback xmlns:cr="http://schemas.microsoft.com/office/comments/2020/reactions" xmlns="http://schemas.microsoft.com/office/tasks/2019/documenttasks" xmlns:dgm="http://schemas.openxmlformats.org/drawingml/2006/diagram" xmlns:lc="http://schemas.openxmlformats.org/drawingml/2006/lockedCanvas" xmlns:c="http://schemas.openxmlformats.org/drawingml/2006/chart" xmlns:pic="http://schemas.openxmlformats.org/drawingml/2006/picture" xmlns:a="http://schemas.openxmlformats.org/drawingml/2006/main" xmlns:sl="http://schemas.openxmlformats.org/schemaLibrary/2006/main">
+                <mc:Fallback xmlns:sl="http://schemas.openxmlformats.org/schemaLibrary/2006/main" xmlns:a="http://schemas.openxmlformats.org/drawingml/2006/main" xmlns:pic="http://schemas.openxmlformats.org/drawingml/2006/picture" xmlns:c="http://schemas.openxmlformats.org/drawingml/2006/chart" xmlns:lc="http://schemas.openxmlformats.org/drawingml/2006/lockedCanvas" xmlns:dgm="http://schemas.openxmlformats.org/drawingml/2006/diagram" xmlns="http://schemas.microsoft.com/office/tasks/2019/documenttasks" xmlns:cr="http://schemas.microsoft.com/office/comments/2020/reactions">
                   <w:drawing>
                     <wp:anchor allowOverlap="1" behindDoc="0" distB="0" distT="0" distL="114300" distR="114300" hidden="0" layoutInCell="1" locked="0" relativeHeight="0" simplePos="0">
                       <wp:simplePos x="0" y="0"/>
@@ -2050,6 +2050,17 @@
             <w:pPr>
               <w:jc w:val="center"/>
             </w:pPr>
+            <w:r>
+              <w:t>{{</w:t>
+            </w:r>
+            <w:proofErr w:type="spellStart"/>
+            <w:r>
+              <w:t>TEnantSex</w:t>
+            </w:r>
+            <w:proofErr w:type="spellEnd"/>
+            <w:r>
+              <w:t>}}</w:t>
+            </w:r>
           </w:p>
         </w:tc>
         <w:tc>
@@ -2066,7 +2077,19 @@
           <w:tcPr>
             <w:tcW w:w="1200" w:type="dxa"/>
           </w:tcPr>
-          <w:p/>
+          <w:p>
+            <w:r>
+              <w:t>{{</w:t>
+            </w:r>
+            <w:proofErr w:type="spellStart"/>
+            <w:r>
+              <w:t>TenantDOB</w:t>
+            </w:r>
+            <w:proofErr w:type="spellEnd"/>
+            <w:r>
+              <w:t>}}</w:t>
+            </w:r>
+          </w:p>
         </w:tc>
         <w:tc>
           <w:tcPr>

</xml_diff>